<commit_message>
docs: update Word brief with official Procureflow_Logo and designated contacts
</commit_message>
<xml_diff>
--- a/docs/ProcureFlow_Update_Brief_Dynamic_Supplier_Stock_and_Reservations.docx
+++ b/docs/ProcureFlow_Update_Brief_Dynamic_Supplier_Stock_and_Reservations.docx
@@ -4,13 +4,13 @@
   <w:body>
     <w:p>
       <w:pPr>
-        <w:spacing w:after="80"/>
+        <w:spacing w:after="120"/>
         <w:jc w:val="left"/>
       </w:pPr>
       <w:r>
         <w:drawing>
           <wp:inline xmlns:a="http://schemas.openxmlformats.org/drawingml/2006/main" xmlns:pic="http://schemas.openxmlformats.org/drawingml/2006/picture">
-            <wp:extent cx="2560320" cy="410830"/>
+            <wp:extent cx="2194560" cy="731520"/>
             <wp:docPr id="1" name="Picture 1"/>
             <wp:cNvGraphicFramePr>
               <a:graphicFrameLocks noChangeAspect="1"/>
@@ -19,7 +19,7 @@
               <a:graphicData uri="http://schemas.openxmlformats.org/drawingml/2006/picture">
                 <pic:pic>
                   <pic:nvPicPr>
-                    <pic:cNvPr id="0" name="ProcureFlow-Title.png"/>
+                    <pic:cNvPr id="0" name="Procureflow_Logo.png"/>
                     <pic:cNvPicPr/>
                   </pic:nvPicPr>
                   <pic:blipFill>
@@ -31,7 +31,7 @@
                   <pic:spPr>
                     <a:xfrm>
                       <a:off x="0" y="0"/>
-                      <a:ext cx="2560320" cy="410830"/>
+                      <a:ext cx="2194560" cy="731520"/>
                     </a:xfrm>
                     <a:prstGeom prst="rect"/>
                   </pic:spPr>
@@ -1480,56 +1480,215 @@
           <w:color w:val="0F294A"/>
           <w:sz w:val="28"/>
         </w:rPr>
-        <w:t>Questions &amp; Support</w:t>
+        <w:t>Questions &amp; Key Contacts</w:t>
       </w:r>
     </w:p>
     <w:p>
       <w:pPr>
-        <w:spacing w:before="80" w:after="120"/>
+        <w:spacing w:before="80" w:after="160"/>
       </w:pPr>
       <w:r>
-        <w:t>For system support, supplier stock discrepancies, or questions regarding dynamic reservations:</w:t>
-        <w:br/>
+        <w:t>Please direct any questions, discrepancies, or feedback to the appropriate lead below:</w:t>
       </w:r>
+    </w:p>
+    <w:tbl>
+      <w:tblPr>
+        <w:tblW w:type="auto" w:w="0"/>
+        <w:jc w:val="center"/>
+        <w:tblLayout w:type="fixed"/>
+        <w:tblLook w:firstColumn="1" w:firstRow="1" w:lastColumn="0" w:lastRow="0" w:noHBand="0" w:noVBand="1" w:val="04A0"/>
+      </w:tblPr>
+      <w:tblGrid>
+        <w:gridCol w:w="4968"/>
+        <w:gridCol w:w="4968"/>
+      </w:tblGrid>
+      <w:tr>
+        <w:tc>
+          <w:tcPr>
+            <w:tcW w:type="dxa" w:w="4896"/>
+            <w:shd w:fill="F8FAFC"/>
+            <w:tcMar>
+              <w:top w:w="120" w:type="dxa"/>
+              <w:bottom w:w="120" w:type="dxa"/>
+              <w:left w:w="140" w:type="dxa"/>
+              <w:right w:w="140" w:type="dxa"/>
+            </w:tcMar>
+            <w:tcBorders>
+              <w:left w:val="single" w:sz="24" w:space="0" w:color="1E40AF"/>
+              <w:top w:val="single" w:sz="4" w:space="0" w:color="CBD5E1"/>
+              <w:right w:val="single" w:sz="4" w:space="0" w:color="CBD5E1"/>
+              <w:bottom w:val="single" w:sz="4" w:space="0" w:color="CBD5E1"/>
+            </w:tcBorders>
+          </w:tcPr>
+          <w:p>
+            <w:pPr>
+              <w:spacing w:before="0" w:after="40"/>
+            </w:pPr>
+            <w:r>
+              <w:rPr>
+                <w:b/>
+                <w:color w:val="1E40AF"/>
+                <w:sz w:val="16"/>
+              </w:rPr>
+              <w:t>PROCUREMENT &amp; INVENTORY INQUIRIES</w:t>
+              <w:br/>
+            </w:r>
+            <w:r>
+              <w:rPr>
+                <w:b/>
+                <w:color w:val="0F294A"/>
+                <w:sz w:val="22"/>
+              </w:rPr>
+              <w:t>Ashish Chhabra</w:t>
+              <w:br/>
+            </w:r>
+            <w:r>
+              <w:rPr>
+                <w:color w:val="64748B"/>
+                <w:sz w:val="19"/>
+              </w:rPr>
+              <w:t>Procurement &amp; Inventory Manager</w:t>
+              <w:br/>
+            </w:r>
+          </w:p>
+          <w:p>
+            <w:pPr>
+              <w:spacing w:before="40" w:after="80"/>
+            </w:pPr>
+            <w:r>
+              <w:rPr>
+                <w:b/>
+                <w:color w:val="0F294A"/>
+                <w:sz w:val="18"/>
+              </w:rPr>
+              <w:t xml:space="preserve">Email: </w:t>
+            </w:r>
+            <w:r>
+              <w:rPr>
+                <w:color w:val="2563EB"/>
+                <w:sz w:val="18"/>
+                <w:u w:val="single"/>
+              </w:rPr>
+              <w:t>ashish.chhabra@splservices.com.au</w:t>
+            </w:r>
+          </w:p>
+          <w:p>
+            <w:pPr>
+              <w:spacing w:before="40" w:after="0"/>
+            </w:pPr>
+            <w:r>
+              <w:rPr>
+                <w:i/>
+                <w:color w:val="475569"/>
+                <w:sz w:val="17"/>
+              </w:rPr>
+              <w:t>Supplier stock availability, inventory quotas, PO approval escalation, and Concur PO processing queries.</w:t>
+            </w:r>
+          </w:p>
+        </w:tc>
+        <w:tc>
+          <w:tcPr>
+            <w:tcW w:type="dxa" w:w="4896"/>
+            <w:shd w:fill="F8FAFC"/>
+            <w:tcMar>
+              <w:top w:w="120" w:type="dxa"/>
+              <w:bottom w:w="120" w:type="dxa"/>
+              <w:left w:w="140" w:type="dxa"/>
+              <w:right w:w="140" w:type="dxa"/>
+            </w:tcMar>
+            <w:tcBorders>
+              <w:left w:val="single" w:sz="24" w:space="0" w:color="1E40AF"/>
+              <w:top w:val="single" w:sz="4" w:space="0" w:color="CBD5E1"/>
+              <w:right w:val="single" w:sz="4" w:space="0" w:color="CBD5E1"/>
+              <w:bottom w:val="single" w:sz="4" w:space="0" w:color="CBD5E1"/>
+            </w:tcBorders>
+          </w:tcPr>
+          <w:p>
+            <w:pPr>
+              <w:spacing w:before="0" w:after="40"/>
+            </w:pPr>
+            <w:r>
+              <w:rPr>
+                <w:b/>
+                <w:color w:val="1E40AF"/>
+                <w:sz w:val="16"/>
+              </w:rPr>
+              <w:t>PROCUREFLOW DEVELOPMENT &amp; AUTOMATION</w:t>
+              <w:br/>
+            </w:r>
+            <w:r>
+              <w:rPr>
+                <w:b/>
+                <w:color w:val="0F294A"/>
+                <w:sz w:val="22"/>
+              </w:rPr>
+              <w:t>Aaron Bell</w:t>
+              <w:br/>
+            </w:r>
+            <w:r>
+              <w:rPr>
+                <w:color w:val="64748B"/>
+                <w:sz w:val="19"/>
+              </w:rPr>
+              <w:t>Enterprise Data and Automation Manager</w:t>
+              <w:br/>
+            </w:r>
+          </w:p>
+          <w:p>
+            <w:pPr>
+              <w:spacing w:before="40" w:after="80"/>
+            </w:pPr>
+            <w:r>
+              <w:rPr>
+                <w:b/>
+                <w:color w:val="0F294A"/>
+                <w:sz w:val="18"/>
+              </w:rPr>
+              <w:t xml:space="preserve">Email: </w:t>
+            </w:r>
+            <w:r>
+              <w:rPr>
+                <w:color w:val="2563EB"/>
+                <w:sz w:val="18"/>
+                <w:u w:val="single"/>
+              </w:rPr>
+              <w:t>aaron.bell@splservices.com.au</w:t>
+            </w:r>
+          </w:p>
+          <w:p>
+            <w:pPr>
+              <w:spacing w:before="40" w:after="0"/>
+            </w:pPr>
+            <w:r>
+              <w:rPr>
+                <w:i/>
+                <w:color w:val="475569"/>
+                <w:sz w:val="17"/>
+              </w:rPr>
+              <w:t>ProcureFlow platform features, reservation engine logic, reporting tools, and system workflow enhancements.</w:t>
+            </w:r>
+          </w:p>
+        </w:tc>
+      </w:tr>
+    </w:tbl>
+    <w:p>
+      <w:pPr>
+        <w:spacing w:after="200"/>
+      </w:pPr>
     </w:p>
     <w:p>
       <w:pPr>
-        <w:pStyle w:val="ListBullet"/>
-        <w:spacing w:before="40" w:after="80"/>
-        <w:ind w:left="360"/>
+        <w:spacing w:before="80" w:after="80"/>
       </w:pPr>
       <w:r>
         <w:rPr>
           <w:b/>
           <w:color w:val="0F294A"/>
         </w:rPr>
-        <w:t xml:space="preserve">ProcureFlow Support Desk: </w:t>
+        <w:t xml:space="preserve">In-App Help Desk: </w:t>
       </w:r>
       <w:r>
-        <w:rPr>
-          <w:color w:val="1E293B"/>
-        </w:rPr>
-        <w:t>Submit a ticket via the in-app Help Guide &amp; Feedback drawer.</w:t>
-      </w:r>
-    </w:p>
-    <w:p>
-      <w:pPr>
-        <w:pStyle w:val="ListBullet"/>
-        <w:spacing w:before="40" w:after="80"/>
-        <w:ind w:left="360"/>
-      </w:pPr>
-      <w:r>
-        <w:rPr>
-          <w:b/>
-          <w:color w:val="0F294A"/>
-        </w:rPr>
-        <w:t xml:space="preserve">Procurement Systems Team: </w:t>
-      </w:r>
-      <w:r>
-        <w:rPr>
-          <w:color w:val="1E293B"/>
-        </w:rPr>
-        <w:t>Contact your central procurement category manager or buyer.</w:t>
+        <w:t>You can also submit instant feedback or log support tickets directly within ProcureFlow using the Help &amp; Guide drawer on any screen.</w:t>
       </w:r>
     </w:p>
     <w:sectPr>

</xml_diff>

<commit_message>
docs: standardize major feature update brief template and embed visuals in Word brief
</commit_message>
<xml_diff>
--- a/docs/ProcureFlow_Update_Brief_Dynamic_Supplier_Stock_and_Reservations.docx
+++ b/docs/ProcureFlow_Update_Brief_Dynamic_Supplier_Stock_and_Reservations.docx
@@ -4,13 +4,13 @@
   <w:body>
     <w:p>
       <w:pPr>
-        <w:spacing w:after="120"/>
+        <w:spacing w:after="80" w:before="0"/>
         <w:jc w:val="left"/>
       </w:pPr>
       <w:r>
         <w:drawing>
           <wp:inline xmlns:a="http://schemas.openxmlformats.org/drawingml/2006/main" xmlns:pic="http://schemas.openxmlformats.org/drawingml/2006/picture">
-            <wp:extent cx="2194560" cy="731520"/>
+            <wp:extent cx="2286000" cy="762000"/>
             <wp:docPr id="1" name="Picture 1"/>
             <wp:cNvGraphicFramePr>
               <a:graphicFrameLocks noChangeAspect="1"/>
@@ -31,7 +31,7 @@
                   <pic:spPr>
                     <a:xfrm>
                       <a:off x="0" y="0"/>
-                      <a:ext cx="2194560" cy="731520"/>
+                      <a:ext cx="2286000" cy="762000"/>
                     </a:xfrm>
                     <a:prstGeom prst="rect"/>
                   </pic:spPr>
@@ -44,28 +44,28 @@
     </w:p>
     <w:p>
       <w:pPr>
-        <w:spacing w:after="40" w:before="80"/>
+        <w:spacing w:after="40" w:before="40"/>
       </w:pPr>
       <w:r>
         <w:rPr>
           <w:rFonts w:ascii="Calibri" w:hAnsi="Calibri"/>
           <w:b/>
           <w:color w:val="0F294A"/>
-          <w:sz w:val="40"/>
+          <w:sz w:val="36"/>
         </w:rPr>
         <w:t>Feature Release Brief: Dynamic Supplier Stock &amp; 48-Hour Reservations</w:t>
       </w:r>
     </w:p>
     <w:p>
       <w:pPr>
-        <w:spacing w:after="240"/>
+        <w:spacing w:after="160"/>
       </w:pPr>
       <w:r>
         <w:rPr>
           <w:rFonts w:ascii="Calibri" w:hAnsi="Calibri"/>
           <w:i/>
           <w:color w:val="64748B"/>
-          <w:sz w:val="22"/>
+          <w:sz w:val="20"/>
         </w:rPr>
         <w:t>Real-time available stock visibility, automated 48h fair-share reservations, and supplier stock analytics.</w:t>
       </w:r>
@@ -78,21 +78,21 @@
         <w:tblLook w:firstColumn="1" w:firstRow="1" w:lastColumn="0" w:lastRow="0" w:noHBand="0" w:noVBand="1" w:val="04A0"/>
       </w:tblPr>
       <w:tblGrid>
-        <w:gridCol w:w="2484"/>
-        <w:gridCol w:w="2484"/>
-        <w:gridCol w:w="2484"/>
-        <w:gridCol w:w="2484"/>
+        <w:gridCol w:w="2520"/>
+        <w:gridCol w:w="2520"/>
+        <w:gridCol w:w="2520"/>
+        <w:gridCol w:w="2520"/>
       </w:tblGrid>
       <w:tr>
         <w:tc>
           <w:tcPr>
-            <w:tcW w:type="dxa" w:w="2484"/>
+            <w:tcW w:type="dxa" w:w="2520"/>
             <w:shd w:fill="0F294A"/>
             <w:tcMar>
-              <w:top w:w="80" w:type="dxa"/>
-              <w:bottom w:w="60" w:type="dxa"/>
-              <w:left w:w="120" w:type="dxa"/>
-              <w:right w:w="120" w:type="dxa"/>
+              <w:top w:w="60" w:type="dxa"/>
+              <w:bottom w:w="50" w:type="dxa"/>
+              <w:left w:w="100" w:type="dxa"/>
+              <w:right w:w="100" w:type="dxa"/>
             </w:tcMar>
             <w:tcBorders>
               <w:top w:val="single" w:sz="4" w:space="0" w:color="CBD5E1"/>
@@ -103,13 +103,13 @@
           </w:tcPr>
           <w:p>
             <w:pPr>
-              <w:spacing w:after="0" w:before="0"/>
+              <w:spacing w:after="0"/>
             </w:pPr>
             <w:r>
               <w:rPr>
                 <w:b/>
                 <w:color w:val="FFFFFF"/>
-                <w:sz w:val="16"/>
+                <w:sz w:val="15"/>
               </w:rPr>
               <w:t>RELEASE DATE</w:t>
             </w:r>
@@ -117,13 +117,13 @@
         </w:tc>
         <w:tc>
           <w:tcPr>
-            <w:tcW w:type="dxa" w:w="2484"/>
+            <w:tcW w:type="dxa" w:w="2520"/>
             <w:shd w:fill="0F294A"/>
             <w:tcMar>
-              <w:top w:w="80" w:type="dxa"/>
-              <w:bottom w:w="60" w:type="dxa"/>
-              <w:left w:w="120" w:type="dxa"/>
-              <w:right w:w="120" w:type="dxa"/>
+              <w:top w:w="60" w:type="dxa"/>
+              <w:bottom w:w="50" w:type="dxa"/>
+              <w:left w:w="100" w:type="dxa"/>
+              <w:right w:w="100" w:type="dxa"/>
             </w:tcMar>
             <w:tcBorders>
               <w:top w:val="single" w:sz="4" w:space="0" w:color="CBD5E1"/>
@@ -134,13 +134,13 @@
           </w:tcPr>
           <w:p>
             <w:pPr>
-              <w:spacing w:after="0" w:before="0"/>
+              <w:spacing w:after="0"/>
             </w:pPr>
             <w:r>
               <w:rPr>
                 <w:b/>
                 <w:color w:val="FFFFFF"/>
-                <w:sz w:val="16"/>
+                <w:sz w:val="15"/>
               </w:rPr>
               <w:t>VERSION</w:t>
             </w:r>
@@ -148,13 +148,13 @@
         </w:tc>
         <w:tc>
           <w:tcPr>
-            <w:tcW w:type="dxa" w:w="2484"/>
+            <w:tcW w:type="dxa" w:w="2520"/>
             <w:shd w:fill="0F294A"/>
             <w:tcMar>
-              <w:top w:w="80" w:type="dxa"/>
-              <w:bottom w:w="60" w:type="dxa"/>
-              <w:left w:w="120" w:type="dxa"/>
-              <w:right w:w="120" w:type="dxa"/>
+              <w:top w:w="60" w:type="dxa"/>
+              <w:bottom w:w="50" w:type="dxa"/>
+              <w:left w:w="100" w:type="dxa"/>
+              <w:right w:w="100" w:type="dxa"/>
             </w:tcMar>
             <w:tcBorders>
               <w:top w:val="single" w:sz="4" w:space="0" w:color="CBD5E1"/>
@@ -165,13 +165,13 @@
           </w:tcPr>
           <w:p>
             <w:pPr>
-              <w:spacing w:after="0" w:before="0"/>
+              <w:spacing w:after="0"/>
             </w:pPr>
             <w:r>
               <w:rPr>
                 <w:b/>
                 <w:color w:val="FFFFFF"/>
-                <w:sz w:val="16"/>
+                <w:sz w:val="15"/>
               </w:rPr>
               <w:t>AUDIENCE</w:t>
             </w:r>
@@ -179,13 +179,13 @@
         </w:tc>
         <w:tc>
           <w:tcPr>
-            <w:tcW w:type="dxa" w:w="2484"/>
+            <w:tcW w:type="dxa" w:w="2520"/>
             <w:shd w:fill="0F294A"/>
             <w:tcMar>
-              <w:top w:w="80" w:type="dxa"/>
-              <w:bottom w:w="60" w:type="dxa"/>
-              <w:left w:w="120" w:type="dxa"/>
-              <w:right w:w="120" w:type="dxa"/>
+              <w:top w:w="60" w:type="dxa"/>
+              <w:bottom w:w="50" w:type="dxa"/>
+              <w:left w:w="100" w:type="dxa"/>
+              <w:right w:w="100" w:type="dxa"/>
             </w:tcMar>
             <w:tcBorders>
               <w:top w:val="single" w:sz="4" w:space="0" w:color="CBD5E1"/>
@@ -196,15 +196,15 @@
           </w:tcPr>
           <w:p>
             <w:pPr>
-              <w:spacing w:after="0" w:before="0"/>
+              <w:spacing w:after="0"/>
             </w:pPr>
             <w:r>
               <w:rPr>
                 <w:b/>
                 <w:color w:val="FFFFFF"/>
-                <w:sz w:val="16"/>
+                <w:sz w:val="15"/>
               </w:rPr>
-              <w:t>MODULE</w:t>
+              <w:t>SYSTEM MODULE</w:t>
             </w:r>
           </w:p>
         </w:tc>
@@ -212,13 +212,13 @@
       <w:tr>
         <w:tc>
           <w:tcPr>
-            <w:tcW w:type="dxa" w:w="2484"/>
+            <w:tcW w:type="dxa" w:w="2520"/>
             <w:shd w:fill="F8FAFC"/>
             <w:tcMar>
-              <w:top w:w="80" w:type="dxa"/>
-              <w:bottom w:w="80" w:type="dxa"/>
-              <w:left w:w="120" w:type="dxa"/>
-              <w:right w:w="120" w:type="dxa"/>
+              <w:top w:w="60" w:type="dxa"/>
+              <w:bottom w:w="60" w:type="dxa"/>
+              <w:left w:w="100" w:type="dxa"/>
+              <w:right w:w="100" w:type="dxa"/>
             </w:tcMar>
             <w:tcBorders>
               <w:top w:val="single" w:sz="4" w:space="0" w:color="CBD5E1"/>
@@ -229,13 +229,13 @@
           </w:tcPr>
           <w:p>
             <w:pPr>
-              <w:spacing w:after="0" w:before="0"/>
+              <w:spacing w:after="0"/>
             </w:pPr>
             <w:r>
               <w:rPr>
                 <w:b/>
                 <w:color w:val="0F294A"/>
-                <w:sz w:val="19"/>
+                <w:sz w:val="17"/>
               </w:rPr>
               <w:t>24 September 2026</w:t>
             </w:r>
@@ -243,13 +243,13 @@
         </w:tc>
         <w:tc>
           <w:tcPr>
-            <w:tcW w:type="dxa" w:w="2484"/>
+            <w:tcW w:type="dxa" w:w="2520"/>
             <w:shd w:fill="F8FAFC"/>
             <w:tcMar>
-              <w:top w:w="80" w:type="dxa"/>
-              <w:bottom w:w="80" w:type="dxa"/>
-              <w:left w:w="120" w:type="dxa"/>
-              <w:right w:w="120" w:type="dxa"/>
+              <w:top w:w="60" w:type="dxa"/>
+              <w:bottom w:w="60" w:type="dxa"/>
+              <w:left w:w="100" w:type="dxa"/>
+              <w:right w:w="100" w:type="dxa"/>
             </w:tcMar>
             <w:tcBorders>
               <w:top w:val="single" w:sz="4" w:space="0" w:color="CBD5E1"/>
@@ -260,13 +260,13 @@
           </w:tcPr>
           <w:p>
             <w:pPr>
-              <w:spacing w:after="0" w:before="0"/>
+              <w:spacing w:after="0"/>
             </w:pPr>
             <w:r>
               <w:rPr>
                 <w:b/>
                 <w:color w:val="0F294A"/>
-                <w:sz w:val="19"/>
+                <w:sz w:val="17"/>
               </w:rPr>
               <w:t>Release v2.4 (Live)</w:t>
             </w:r>
@@ -274,13 +274,13 @@
         </w:tc>
         <w:tc>
           <w:tcPr>
-            <w:tcW w:type="dxa" w:w="2484"/>
+            <w:tcW w:type="dxa" w:w="2520"/>
             <w:shd w:fill="F8FAFC"/>
             <w:tcMar>
-              <w:top w:w="80" w:type="dxa"/>
-              <w:bottom w:w="80" w:type="dxa"/>
-              <w:left w:w="120" w:type="dxa"/>
-              <w:right w:w="120" w:type="dxa"/>
+              <w:top w:w="60" w:type="dxa"/>
+              <w:bottom w:w="60" w:type="dxa"/>
+              <w:left w:w="100" w:type="dxa"/>
+              <w:right w:w="100" w:type="dxa"/>
             </w:tcMar>
             <w:tcBorders>
               <w:top w:val="single" w:sz="4" w:space="0" w:color="CBD5E1"/>
@@ -291,13 +291,13 @@
           </w:tcPr>
           <w:p>
             <w:pPr>
-              <w:spacing w:after="0" w:before="0"/>
+              <w:spacing w:after="0"/>
             </w:pPr>
             <w:r>
               <w:rPr>
                 <w:b/>
                 <w:color w:val="0F294A"/>
-                <w:sz w:val="19"/>
+                <w:sz w:val="17"/>
               </w:rPr>
               <w:t>Requisitioners, Approvers, Buyers</w:t>
             </w:r>
@@ -305,13 +305,13 @@
         </w:tc>
         <w:tc>
           <w:tcPr>
-            <w:tcW w:type="dxa" w:w="2484"/>
+            <w:tcW w:type="dxa" w:w="2520"/>
             <w:shd w:fill="F8FAFC"/>
             <w:tcMar>
-              <w:top w:w="80" w:type="dxa"/>
-              <w:bottom w:w="80" w:type="dxa"/>
-              <w:left w:w="120" w:type="dxa"/>
-              <w:right w:w="120" w:type="dxa"/>
+              <w:top w:w="60" w:type="dxa"/>
+              <w:bottom w:w="60" w:type="dxa"/>
+              <w:left w:w="100" w:type="dxa"/>
+              <w:right w:w="100" w:type="dxa"/>
             </w:tcMar>
             <w:tcBorders>
               <w:top w:val="single" w:sz="4" w:space="0" w:color="CBD5E1"/>
@@ -322,13 +322,13 @@
           </w:tcPr>
           <w:p>
             <w:pPr>
-              <w:spacing w:after="0" w:before="0"/>
+              <w:spacing w:after="0"/>
             </w:pPr>
             <w:r>
               <w:rPr>
                 <w:b/>
                 <w:color w:val="0F294A"/>
-                <w:sz w:val="19"/>
+                <w:sz w:val="17"/>
               </w:rPr>
               <w:t>Stock &amp; Requisitions</w:t>
             </w:r>
@@ -338,7 +338,7 @@
     </w:tbl>
     <w:p>
       <w:pPr>
-        <w:spacing w:after="160"/>
+        <w:spacing w:after="120"/>
       </w:pPr>
     </w:p>
     <w:tbl>
@@ -347,35 +347,35 @@
         <w:tblLook w:firstColumn="1" w:firstRow="1" w:lastColumn="0" w:lastRow="0" w:noHBand="0" w:noVBand="1" w:val="04A0"/>
       </w:tblPr>
       <w:tblGrid>
-        <w:gridCol w:w="9936"/>
+        <w:gridCol w:w="10080"/>
       </w:tblGrid>
       <w:tr>
         <w:tc>
           <w:tcPr>
-            <w:tcW w:type="dxa" w:w="9936"/>
+            <w:tcW w:type="dxa" w:w="10080"/>
             <w:shd w:fill="EFF6FF"/>
             <w:tcBorders>
-              <w:left w:val="single" w:sz="36" w:space="0" w:color="2563EB"/>
+              <w:left w:val="single" w:sz="36" w:space="0" w:color="1E40AF"/>
               <w:top w:val="none"/>
               <w:right w:val="none"/>
               <w:bottom w:val="none"/>
             </w:tcBorders>
             <w:tcMar>
-              <w:top w:w="140" w:type="dxa"/>
-              <w:bottom w:w="140" w:type="dxa"/>
-              <w:left w:w="180" w:type="dxa"/>
-              <w:right w:w="180" w:type="dxa"/>
+              <w:top w:w="100" w:type="dxa"/>
+              <w:bottom w:w="100" w:type="dxa"/>
+              <w:left w:w="140" w:type="dxa"/>
+              <w:right w:w="140" w:type="dxa"/>
             </w:tcMar>
           </w:tcPr>
           <w:p>
             <w:pPr>
-              <w:spacing w:after="80"/>
+              <w:spacing w:after="40"/>
             </w:pPr>
             <w:r>
               <w:rPr>
                 <w:b/>
                 <w:color w:val="1E40AF"/>
-                <w:sz w:val="22"/>
+                <w:sz w:val="21"/>
               </w:rPr>
               <w:t>Executive Overview: Accurate Stock &amp; Fair Inventory Allocation</w:t>
               <w:br/>
@@ -383,9 +383,9 @@
             <w:r>
               <w:rPr>
                 <w:color w:val="1E293B"/>
-                <w:sz w:val="20"/>
+                <w:sz w:val="19"/>
               </w:rPr>
-              <w:t>To prevent duplicate ordering and eliminate 'ghost stock' across SPL plants, ProcureFlow now tracks a live running total of available supplier stock. Approved requests place inventory into a temporary 48-hour reservation holding pattern. If a Concur PO # is not linked within 48 hours, the order is automatically cancelled and the reserved stock is returned to the available pool for all other users.</w:t>
+              <w:t>To eliminate duplicate ordering and 'ghost stock' across SPL plants, ProcureFlow now tracks a live running total of available supplier stock. Approved requests place inventory into a temporary 48-hour reservation holding pattern. If a Concur PO # is not linked within 48 hours, the order is automatically cancelled and the reserved stock is returned to the available pool for all other users.</w:t>
             </w:r>
           </w:p>
         </w:tc>
@@ -393,8 +393,59 @@
     </w:tbl>
     <w:p>
       <w:pPr>
-        <w:spacing w:after="160"/>
+        <w:keepNext/>
+        <w:spacing w:before="160" w:after="40"/>
+        <w:jc w:val="center"/>
       </w:pPr>
+      <w:r>
+        <w:drawing>
+          <wp:inline xmlns:a="http://schemas.openxmlformats.org/drawingml/2006/main" xmlns:pic="http://schemas.openxmlformats.org/drawingml/2006/picture">
+            <wp:extent cx="6217920" cy="3045512"/>
+            <wp:docPr id="2" name="Picture 2"/>
+            <wp:cNvGraphicFramePr>
+              <a:graphicFrameLocks noChangeAspect="1"/>
+            </wp:cNvGraphicFramePr>
+            <a:graphic>
+              <a:graphicData uri="http://schemas.openxmlformats.org/drawingml/2006/picture">
+                <pic:pic>
+                  <pic:nvPicPr>
+                    <pic:cNvPr id="0" name="lifecycle_workflow.png"/>
+                    <pic:cNvPicPr/>
+                  </pic:nvPicPr>
+                  <pic:blipFill>
+                    <a:blip r:embed="rId10"/>
+                    <a:stretch>
+                      <a:fillRect/>
+                    </a:stretch>
+                  </pic:blipFill>
+                  <pic:spPr>
+                    <a:xfrm>
+                      <a:off x="0" y="0"/>
+                      <a:ext cx="6217920" cy="3045512"/>
+                    </a:xfrm>
+                    <a:prstGeom prst="rect"/>
+                  </pic:spPr>
+                </pic:pic>
+              </a:graphicData>
+            </a:graphic>
+          </wp:inline>
+        </w:drawing>
+      </w:r>
+    </w:p>
+    <w:p>
+      <w:pPr>
+        <w:spacing w:before="40" w:after="200"/>
+        <w:jc w:val="center"/>
+      </w:pPr>
+      <w:r>
+        <w:rPr>
+          <w:rFonts w:ascii="Calibri" w:hAnsi="Calibri"/>
+          <w:i/>
+          <w:color w:val="64748B"/>
+          <w:sz w:val="17"/>
+        </w:rPr>
+        <w:t>Figure: End-to-End 48-Hour Reservation &amp; Expiry Lifecycle Workflow</w:t>
+      </w:r>
     </w:p>
     <w:p>
       <w:pPr>
@@ -409,7 +460,7 @@
           <w:rFonts w:ascii="Calibri" w:hAnsi="Calibri"/>
           <w:b/>
           <w:color w:val="0F294A"/>
-          <w:sz w:val="28"/>
+          <w:sz w:val="26"/>
         </w:rPr>
         <w:t>Key Enhancements &amp; How They Work</w:t>
       </w:r>
@@ -417,7 +468,7 @@
     <w:p>
       <w:pPr>
         <w:pStyle w:val="ListBullet"/>
-        <w:spacing w:before="40" w:after="80"/>
+        <w:spacing w:before="40" w:after="60"/>
         <w:ind w:left="360"/>
       </w:pPr>
       <w:r>
@@ -431,13 +482,69 @@
         <w:rPr>
           <w:color w:val="1E293B"/>
         </w:rPr>
-        <w:t>Stock availability is no longer static between weekly supplier reports. ProcureFlow starts with the most recent supplier Stock-on-Hand (SOH) snapshot and continuously deducts both active reservations and committed orders in real time. The orderable quantity shown in the catalogue represents true, available inventory.</w:t>
+        <w:t>Stock availability is no longer static between weekly supplier reports. ProcureFlow starts with the most recent supplier Stock-on-Hand (SOH) snapshot and continuously deducts both active reservations and committed orders in real time. Requisitioners only see inventory that is genuinely orderable.</w:t>
+      </w:r>
+    </w:p>
+    <w:p>
+      <w:pPr>
+        <w:keepNext/>
+        <w:spacing w:before="160" w:after="40"/>
+        <w:jc w:val="center"/>
+      </w:pPr>
+      <w:r>
+        <w:drawing>
+          <wp:inline xmlns:a="http://schemas.openxmlformats.org/drawingml/2006/main" xmlns:pic="http://schemas.openxmlformats.org/drawingml/2006/picture">
+            <wp:extent cx="6217920" cy="2728271"/>
+            <wp:docPr id="3" name="Picture 3"/>
+            <wp:cNvGraphicFramePr>
+              <a:graphicFrameLocks noChangeAspect="1"/>
+            </wp:cNvGraphicFramePr>
+            <a:graphic>
+              <a:graphicData uri="http://schemas.openxmlformats.org/drawingml/2006/picture">
+                <pic:pic>
+                  <pic:nvPicPr>
+                    <pic:cNvPr id="0" name="dynamic_stock_waterfall.png"/>
+                    <pic:cNvPicPr/>
+                  </pic:nvPicPr>
+                  <pic:blipFill>
+                    <a:blip r:embed="rId11"/>
+                    <a:stretch>
+                      <a:fillRect/>
+                    </a:stretch>
+                  </pic:blipFill>
+                  <pic:spPr>
+                    <a:xfrm>
+                      <a:off x="0" y="0"/>
+                      <a:ext cx="6217920" cy="2728271"/>
+                    </a:xfrm>
+                    <a:prstGeom prst="rect"/>
+                  </pic:spPr>
+                </pic:pic>
+              </a:graphicData>
+            </a:graphic>
+          </wp:inline>
+        </w:drawing>
+      </w:r>
+    </w:p>
+    <w:p>
+      <w:pPr>
+        <w:spacing w:before="40" w:after="200"/>
+        <w:jc w:val="center"/>
+      </w:pPr>
+      <w:r>
+        <w:rPr>
+          <w:rFonts w:ascii="Calibri" w:hAnsi="Calibri"/>
+          <w:i/>
+          <w:color w:val="64748B"/>
+          <w:sz w:val="17"/>
+        </w:rPr>
+        <w:t>Figure: Dynamic Running Stock Deduction Formula &amp; Mechanism</w:t>
       </w:r>
     </w:p>
     <w:p>
       <w:pPr>
         <w:pStyle w:val="ListBullet"/>
-        <w:spacing w:before="40" w:after="80"/>
+        <w:spacing w:before="40" w:after="60"/>
         <w:ind w:left="360"/>
       </w:pPr>
       <w:r>
@@ -451,13 +558,13 @@
         <w:rPr>
           <w:color w:val="1E293B"/>
         </w:rPr>
-        <w:t>The moment a requisition receives final approval, its items are placed into a 'Reserved' state. This temporarily earmarks the stock for that plant, preventing other sites from ordering the same inventory while procurement processes the purchase order.</w:t>
+        <w:t>When a requisition receives final approval, its items are placed into a 'Reserved' state. This temporarily locks the stock for that plant, preventing other sites from ordering the same inventory while procurement processes the purchase order.</w:t>
       </w:r>
     </w:p>
     <w:p>
       <w:pPr>
         <w:pStyle w:val="ListBullet"/>
-        <w:spacing w:before="40" w:after="80"/>
+        <w:spacing w:before="40" w:after="60"/>
         <w:ind w:left="360"/>
       </w:pPr>
       <w:r>
@@ -471,7 +578,63 @@
         <w:rPr>
           <w:color w:val="1E293B"/>
         </w:rPr>
-        <w:t>Every approved request features a visible countdown timer showing exactly how much time remains on the reservation. Color-coded urgency indicators keep buyers and requesters informed:</w:t>
+        <w:t>Every approved request displays a visible countdown timer showing exactly how much time remains on the reservation. Color-coded urgency indicators keep buyers and requesters informed:</w:t>
+      </w:r>
+    </w:p>
+    <w:p>
+      <w:pPr>
+        <w:keepNext/>
+        <w:spacing w:before="160" w:after="40"/>
+        <w:jc w:val="center"/>
+      </w:pPr>
+      <w:r>
+        <w:drawing>
+          <wp:inline xmlns:a="http://schemas.openxmlformats.org/drawingml/2006/main" xmlns:pic="http://schemas.openxmlformats.org/drawingml/2006/picture">
+            <wp:extent cx="6217920" cy="2664823"/>
+            <wp:docPr id="4" name="Picture 4"/>
+            <wp:cNvGraphicFramePr>
+              <a:graphicFrameLocks noChangeAspect="1"/>
+            </wp:cNvGraphicFramePr>
+            <a:graphic>
+              <a:graphicData uri="http://schemas.openxmlformats.org/drawingml/2006/picture">
+                <pic:pic>
+                  <pic:nvPicPr>
+                    <pic:cNvPr id="0" name="ui_countdown_badges_and_flyout.png"/>
+                    <pic:cNvPicPr/>
+                  </pic:nvPicPr>
+                  <pic:blipFill>
+                    <a:blip r:embed="rId12"/>
+                    <a:stretch>
+                      <a:fillRect/>
+                    </a:stretch>
+                  </pic:blipFill>
+                  <pic:spPr>
+                    <a:xfrm>
+                      <a:off x="0" y="0"/>
+                      <a:ext cx="6217920" cy="2664823"/>
+                    </a:xfrm>
+                    <a:prstGeom prst="rect"/>
+                  </pic:spPr>
+                </pic:pic>
+              </a:graphicData>
+            </a:graphic>
+          </wp:inline>
+        </w:drawing>
+      </w:r>
+    </w:p>
+    <w:p>
+      <w:pPr>
+        <w:spacing w:before="40" w:after="200"/>
+        <w:jc w:val="center"/>
+      </w:pPr>
+      <w:r>
+        <w:rPr>
+          <w:rFonts w:ascii="Calibri" w:hAnsi="Calibri"/>
+          <w:i/>
+          <w:color w:val="64748B"/>
+          <w:sz w:val="17"/>
+        </w:rPr>
+        <w:t>Figure: Live UI Indicators: Color-Coded Urgency Badges &amp; Dynamic Stock Flyout Panel</w:t>
       </w:r>
     </w:p>
     <w:tbl>
@@ -481,20 +644,20 @@
         <w:tblLook w:firstColumn="1" w:firstRow="1" w:lastColumn="0" w:lastRow="0" w:noHBand="0" w:noVBand="1" w:val="04A0"/>
       </w:tblPr>
       <w:tblGrid>
-        <w:gridCol w:w="3312"/>
-        <w:gridCol w:w="3312"/>
-        <w:gridCol w:w="3312"/>
+        <w:gridCol w:w="3360"/>
+        <w:gridCol w:w="3360"/>
+        <w:gridCol w:w="3360"/>
       </w:tblGrid>
       <w:tr>
         <w:tc>
           <w:tcPr>
-            <w:tcW w:type="dxa" w:w="3312"/>
+            <w:tcW w:type="dxa" w:w="3360"/>
             <w:shd w:fill="0F294A"/>
             <w:tcMar>
-              <w:top w:w="60" w:type="dxa"/>
-              <w:bottom w:w="60" w:type="dxa"/>
-              <w:left w:w="100" w:type="dxa"/>
-              <w:right w:w="100" w:type="dxa"/>
+              <w:top w:w="50" w:type="dxa"/>
+              <w:bottom w:w="50" w:type="dxa"/>
+              <w:left w:w="80" w:type="dxa"/>
+              <w:right w:w="80" w:type="dxa"/>
             </w:tcMar>
           </w:tcPr>
           <w:p>
@@ -502,7 +665,7 @@
               <w:rPr>
                 <w:b/>
                 <w:color w:val="FFFFFF"/>
-                <w:sz w:val="18"/>
+                <w:sz w:val="17"/>
               </w:rPr>
               <w:t>Urgency Tier</w:t>
             </w:r>
@@ -510,13 +673,13 @@
         </w:tc>
         <w:tc>
           <w:tcPr>
-            <w:tcW w:type="dxa" w:w="3312"/>
+            <w:tcW w:type="dxa" w:w="3360"/>
             <w:shd w:fill="0F294A"/>
             <w:tcMar>
-              <w:top w:w="60" w:type="dxa"/>
-              <w:bottom w:w="60" w:type="dxa"/>
-              <w:left w:w="100" w:type="dxa"/>
-              <w:right w:w="100" w:type="dxa"/>
+              <w:top w:w="50" w:type="dxa"/>
+              <w:bottom w:w="50" w:type="dxa"/>
+              <w:left w:w="80" w:type="dxa"/>
+              <w:right w:w="80" w:type="dxa"/>
             </w:tcMar>
           </w:tcPr>
           <w:p>
@@ -524,7 +687,7 @@
               <w:rPr>
                 <w:b/>
                 <w:color w:val="FFFFFF"/>
-                <w:sz w:val="18"/>
+                <w:sz w:val="17"/>
               </w:rPr>
               <w:t>Time Remaining</w:t>
             </w:r>
@@ -532,13 +695,13 @@
         </w:tc>
         <w:tc>
           <w:tcPr>
-            <w:tcW w:type="dxa" w:w="3312"/>
+            <w:tcW w:type="dxa" w:w="3360"/>
             <w:shd w:fill="0F294A"/>
             <w:tcMar>
-              <w:top w:w="60" w:type="dxa"/>
-              <w:bottom w:w="60" w:type="dxa"/>
-              <w:left w:w="100" w:type="dxa"/>
-              <w:right w:w="100" w:type="dxa"/>
+              <w:top w:w="50" w:type="dxa"/>
+              <w:bottom w:w="50" w:type="dxa"/>
+              <w:left w:w="80" w:type="dxa"/>
+              <w:right w:w="80" w:type="dxa"/>
             </w:tcMar>
           </w:tcPr>
           <w:p>
@@ -546,7 +709,7 @@
               <w:rPr>
                 <w:b/>
                 <w:color w:val="FFFFFF"/>
-                <w:sz w:val="18"/>
+                <w:sz w:val="17"/>
               </w:rPr>
               <w:t>Action Required</w:t>
             </w:r>
@@ -556,13 +719,13 @@
       <w:tr>
         <w:tc>
           <w:tcPr>
-            <w:tcW w:type="dxa" w:w="3312"/>
+            <w:tcW w:type="dxa" w:w="3360"/>
             <w:shd w:fill="F8FAFC"/>
             <w:tcMar>
-              <w:top w:w="60" w:type="dxa"/>
-              <w:bottom w:w="60" w:type="dxa"/>
-              <w:left w:w="100" w:type="dxa"/>
-              <w:right w:w="100" w:type="dxa"/>
+              <w:top w:w="50" w:type="dxa"/>
+              <w:bottom w:w="50" w:type="dxa"/>
+              <w:left w:w="80" w:type="dxa"/>
+              <w:right w:w="80" w:type="dxa"/>
             </w:tcMar>
             <w:tcBorders>
               <w:bottom w:val="single" w:sz="4" w:space="0" w:color="E2E8F0"/>
@@ -573,7 +736,7 @@
               <w:rPr>
                 <w:b/>
                 <w:color w:val="1E40AF"/>
-                <w:sz w:val="18"/>
+                <w:sz w:val="17"/>
               </w:rPr>
               <w:t>Normal (Blue)</w:t>
             </w:r>
@@ -581,13 +744,13 @@
         </w:tc>
         <w:tc>
           <w:tcPr>
-            <w:tcW w:type="dxa" w:w="3312"/>
+            <w:tcW w:type="dxa" w:w="3360"/>
             <w:shd w:fill="F8FAFC"/>
             <w:tcMar>
-              <w:top w:w="60" w:type="dxa"/>
-              <w:bottom w:w="60" w:type="dxa"/>
-              <w:left w:w="100" w:type="dxa"/>
-              <w:right w:w="100" w:type="dxa"/>
+              <w:top w:w="50" w:type="dxa"/>
+              <w:bottom w:w="50" w:type="dxa"/>
+              <w:left w:w="80" w:type="dxa"/>
+              <w:right w:w="80" w:type="dxa"/>
             </w:tcMar>
             <w:tcBorders>
               <w:bottom w:val="single" w:sz="4" w:space="0" w:color="E2E8F0"/>
@@ -596,7 +759,7 @@
           <w:p>
             <w:r>
               <w:rPr>
-                <w:sz w:val="18"/>
+                <w:sz w:val="17"/>
               </w:rPr>
               <w:t>&gt; 24 Hours</w:t>
             </w:r>
@@ -604,13 +767,13 @@
         </w:tc>
         <w:tc>
           <w:tcPr>
-            <w:tcW w:type="dxa" w:w="3312"/>
+            <w:tcW w:type="dxa" w:w="3360"/>
             <w:shd w:fill="F8FAFC"/>
             <w:tcMar>
-              <w:top w:w="60" w:type="dxa"/>
-              <w:bottom w:w="60" w:type="dxa"/>
-              <w:left w:w="100" w:type="dxa"/>
-              <w:right w:w="100" w:type="dxa"/>
+              <w:top w:w="50" w:type="dxa"/>
+              <w:bottom w:w="50" w:type="dxa"/>
+              <w:left w:w="80" w:type="dxa"/>
+              <w:right w:w="80" w:type="dxa"/>
             </w:tcMar>
             <w:tcBorders>
               <w:bottom w:val="single" w:sz="4" w:space="0" w:color="E2E8F0"/>
@@ -619,7 +782,7 @@
           <w:p>
             <w:r>
               <w:rPr>
-                <w:sz w:val="18"/>
+                <w:sz w:val="17"/>
               </w:rPr>
               <w:t>Order is comfortably within the procurement processing window.</w:t>
             </w:r>
@@ -629,13 +792,13 @@
       <w:tr>
         <w:tc>
           <w:tcPr>
-            <w:tcW w:type="dxa" w:w="3312"/>
+            <w:tcW w:type="dxa" w:w="3360"/>
             <w:shd w:fill="FFFFFF"/>
             <w:tcMar>
-              <w:top w:w="60" w:type="dxa"/>
-              <w:bottom w:w="60" w:type="dxa"/>
-              <w:left w:w="100" w:type="dxa"/>
-              <w:right w:w="100" w:type="dxa"/>
+              <w:top w:w="50" w:type="dxa"/>
+              <w:bottom w:w="50" w:type="dxa"/>
+              <w:left w:w="80" w:type="dxa"/>
+              <w:right w:w="80" w:type="dxa"/>
             </w:tcMar>
             <w:tcBorders>
               <w:bottom w:val="single" w:sz="4" w:space="0" w:color="E2E8F0"/>
@@ -646,7 +809,7 @@
               <w:rPr>
                 <w:b/>
                 <w:color w:val="D97706"/>
-                <w:sz w:val="18"/>
+                <w:sz w:val="17"/>
               </w:rPr>
               <w:t>Warning (Amber)</w:t>
             </w:r>
@@ -654,13 +817,13 @@
         </w:tc>
         <w:tc>
           <w:tcPr>
-            <w:tcW w:type="dxa" w:w="3312"/>
+            <w:tcW w:type="dxa" w:w="3360"/>
             <w:shd w:fill="FFFFFF"/>
             <w:tcMar>
-              <w:top w:w="60" w:type="dxa"/>
-              <w:bottom w:w="60" w:type="dxa"/>
-              <w:left w:w="100" w:type="dxa"/>
-              <w:right w:w="100" w:type="dxa"/>
+              <w:top w:w="50" w:type="dxa"/>
+              <w:bottom w:w="50" w:type="dxa"/>
+              <w:left w:w="80" w:type="dxa"/>
+              <w:right w:w="80" w:type="dxa"/>
             </w:tcMar>
             <w:tcBorders>
               <w:bottom w:val="single" w:sz="4" w:space="0" w:color="E2E8F0"/>
@@ -669,7 +832,7 @@
           <w:p>
             <w:r>
               <w:rPr>
-                <w:sz w:val="18"/>
+                <w:sz w:val="17"/>
               </w:rPr>
               <w:t>12 to 24 Hours</w:t>
             </w:r>
@@ -677,13 +840,13 @@
         </w:tc>
         <w:tc>
           <w:tcPr>
-            <w:tcW w:type="dxa" w:w="3312"/>
+            <w:tcW w:type="dxa" w:w="3360"/>
             <w:shd w:fill="FFFFFF"/>
             <w:tcMar>
-              <w:top w:w="60" w:type="dxa"/>
-              <w:bottom w:w="60" w:type="dxa"/>
-              <w:left w:w="100" w:type="dxa"/>
-              <w:right w:w="100" w:type="dxa"/>
+              <w:top w:w="50" w:type="dxa"/>
+              <w:bottom w:w="50" w:type="dxa"/>
+              <w:left w:w="80" w:type="dxa"/>
+              <w:right w:w="80" w:type="dxa"/>
             </w:tcMar>
             <w:tcBorders>
               <w:bottom w:val="single" w:sz="4" w:space="0" w:color="E2E8F0"/>
@@ -692,7 +855,7 @@
           <w:p>
             <w:r>
               <w:rPr>
-                <w:sz w:val="18"/>
+                <w:sz w:val="17"/>
               </w:rPr>
               <w:t>Priority reminder: Concur PO # should be requested or entered promptly.</w:t>
             </w:r>
@@ -702,13 +865,13 @@
       <w:tr>
         <w:tc>
           <w:tcPr>
-            <w:tcW w:type="dxa" w:w="3312"/>
+            <w:tcW w:type="dxa" w:w="3360"/>
             <w:shd w:fill="F8FAFC"/>
             <w:tcMar>
-              <w:top w:w="60" w:type="dxa"/>
-              <w:bottom w:w="60" w:type="dxa"/>
-              <w:left w:w="100" w:type="dxa"/>
-              <w:right w:w="100" w:type="dxa"/>
+              <w:top w:w="50" w:type="dxa"/>
+              <w:bottom w:w="50" w:type="dxa"/>
+              <w:left w:w="80" w:type="dxa"/>
+              <w:right w:w="80" w:type="dxa"/>
             </w:tcMar>
             <w:tcBorders>
               <w:bottom w:val="single" w:sz="4" w:space="0" w:color="E2E8F0"/>
@@ -719,7 +882,7 @@
               <w:rPr>
                 <w:b/>
                 <w:color w:val="DC2626"/>
-                <w:sz w:val="18"/>
+                <w:sz w:val="17"/>
               </w:rPr>
               <w:t>Critical (Red / Pulse)</w:t>
             </w:r>
@@ -727,13 +890,13 @@
         </w:tc>
         <w:tc>
           <w:tcPr>
-            <w:tcW w:type="dxa" w:w="3312"/>
+            <w:tcW w:type="dxa" w:w="3360"/>
             <w:shd w:fill="F8FAFC"/>
             <w:tcMar>
-              <w:top w:w="60" w:type="dxa"/>
-              <w:bottom w:w="60" w:type="dxa"/>
-              <w:left w:w="100" w:type="dxa"/>
-              <w:right w:w="100" w:type="dxa"/>
+              <w:top w:w="50" w:type="dxa"/>
+              <w:bottom w:w="50" w:type="dxa"/>
+              <w:left w:w="80" w:type="dxa"/>
+              <w:right w:w="80" w:type="dxa"/>
             </w:tcMar>
             <w:tcBorders>
               <w:bottom w:val="single" w:sz="4" w:space="0" w:color="E2E8F0"/>
@@ -742,7 +905,7 @@
           <w:p>
             <w:r>
               <w:rPr>
-                <w:sz w:val="18"/>
+                <w:sz w:val="17"/>
               </w:rPr>
               <w:t>&lt; 12 Hours</w:t>
             </w:r>
@@ -750,13 +913,13 @@
         </w:tc>
         <w:tc>
           <w:tcPr>
-            <w:tcW w:type="dxa" w:w="3312"/>
+            <w:tcW w:type="dxa" w:w="3360"/>
             <w:shd w:fill="F8FAFC"/>
             <w:tcMar>
-              <w:top w:w="60" w:type="dxa"/>
-              <w:bottom w:w="60" w:type="dxa"/>
-              <w:left w:w="100" w:type="dxa"/>
-              <w:right w:w="100" w:type="dxa"/>
+              <w:top w:w="50" w:type="dxa"/>
+              <w:bottom w:w="50" w:type="dxa"/>
+              <w:left w:w="80" w:type="dxa"/>
+              <w:right w:w="80" w:type="dxa"/>
             </w:tcMar>
             <w:tcBorders>
               <w:bottom w:val="single" w:sz="4" w:space="0" w:color="E2E8F0"/>
@@ -765,7 +928,7 @@
           <w:p>
             <w:r>
               <w:rPr>
-                <w:sz w:val="18"/>
+                <w:sz w:val="17"/>
               </w:rPr>
               <w:t>Urgent action: Order will expire and auto-cancel if PO is not entered today.</w:t>
             </w:r>
@@ -781,7 +944,7 @@
     <w:p>
       <w:pPr>
         <w:pStyle w:val="ListBullet"/>
-        <w:spacing w:before="40" w:after="80"/>
+        <w:spacing w:before="40" w:after="60"/>
         <w:ind w:left="360"/>
       </w:pPr>
       <w:r>
@@ -795,13 +958,13 @@
         <w:rPr>
           <w:color w:val="1E293B"/>
         </w:rPr>
-        <w:t>Once a buyer enters the Concur PO #, the order advances to 'Active (Awaiting Delivery)'. The inventory permanently shifts from 'Reserved' to 'Committed', remaining accounted for until delivery dockets and physical stock receipting are fully recorded.</w:t>
+        <w:t>Once a buyer enters the Concur PO #, the order advances to 'Active (Awaiting Delivery)'. The inventory permanently shifts from 'Reserved' to 'Committed', remaining accounted for until delivery dockets and physical stock receipting are fully completed.</w:t>
       </w:r>
     </w:p>
     <w:p>
       <w:pPr>
         <w:pStyle w:val="ListBullet"/>
-        <w:spacing w:before="40" w:after="80"/>
+        <w:spacing w:before="40" w:after="60"/>
         <w:ind w:left="360"/>
       </w:pPr>
       <w:r>
@@ -831,17 +994,17 @@
           <w:rFonts w:ascii="Calibri" w:hAnsi="Calibri"/>
           <w:b/>
           <w:color w:val="0F294A"/>
-          <w:sz w:val="28"/>
+          <w:sz w:val="26"/>
         </w:rPr>
         <w:t>New 'Stock &amp; Reservations' Insights Report</w:t>
       </w:r>
     </w:p>
     <w:p>
       <w:pPr>
-        <w:spacing w:before="80" w:after="120"/>
+        <w:spacing w:before="80" w:after="80"/>
       </w:pPr>
       <w:r>
-        <w:t xml:space="preserve">A dedicated report has been added under </w:t>
+        <w:t xml:space="preserve">Located under </w:t>
       </w:r>
       <w:r>
         <w:rPr>
@@ -851,13 +1014,69 @@
         <w:t>Reporting ➔ Supplier Insights ➔ Stock Reservations</w:t>
       </w:r>
       <w:r>
-        <w:t>, providing full transparency into inventory distribution across suppliers, active holds, and order pipeline health:</w:t>
+        <w:t>, this interactive analytics suite gives full visibility into inventory distribution, active holds, and order pipeline health:</w:t>
+      </w:r>
+    </w:p>
+    <w:p>
+      <w:pPr>
+        <w:keepNext/>
+        <w:spacing w:before="160" w:after="40"/>
+        <w:jc w:val="center"/>
+      </w:pPr>
+      <w:r>
+        <w:drawing>
+          <wp:inline xmlns:a="http://schemas.openxmlformats.org/drawingml/2006/main" xmlns:pic="http://schemas.openxmlformats.org/drawingml/2006/picture">
+            <wp:extent cx="6217920" cy="2943995"/>
+            <wp:docPr id="5" name="Picture 5"/>
+            <wp:cNvGraphicFramePr>
+              <a:graphicFrameLocks noChangeAspect="1"/>
+            </wp:cNvGraphicFramePr>
+            <a:graphic>
+              <a:graphicData uri="http://schemas.openxmlformats.org/drawingml/2006/picture">
+                <pic:pic>
+                  <pic:nvPicPr>
+                    <pic:cNvPr id="0" name="reporting_dashboard_preview.png"/>
+                    <pic:cNvPicPr/>
+                  </pic:nvPicPr>
+                  <pic:blipFill>
+                    <a:blip r:embed="rId13"/>
+                    <a:stretch>
+                      <a:fillRect/>
+                    </a:stretch>
+                  </pic:blipFill>
+                  <pic:spPr>
+                    <a:xfrm>
+                      <a:off x="0" y="0"/>
+                      <a:ext cx="6217920" cy="2943995"/>
+                    </a:xfrm>
+                    <a:prstGeom prst="rect"/>
+                  </pic:spPr>
+                </pic:pic>
+              </a:graphicData>
+            </a:graphic>
+          </wp:inline>
+        </w:drawing>
+      </w:r>
+    </w:p>
+    <w:p>
+      <w:pPr>
+        <w:spacing w:before="40" w:after="200"/>
+        <w:jc w:val="center"/>
+      </w:pPr>
+      <w:r>
+        <w:rPr>
+          <w:rFonts w:ascii="Calibri" w:hAnsi="Calibri"/>
+          <w:i/>
+          <w:color w:val="64748B"/>
+          <w:sz w:val="17"/>
+        </w:rPr>
+        <w:t>Figure: Stock &amp; Reservations Insights Report: KPI Metrics &amp; Live Reservation Queue</w:t>
       </w:r>
     </w:p>
     <w:p>
       <w:pPr>
         <w:pStyle w:val="ListBullet"/>
-        <w:spacing w:before="40" w:after="80"/>
+        <w:spacing w:before="40" w:after="60"/>
         <w:ind w:left="360"/>
       </w:pPr>
       <w:r>
@@ -877,7 +1096,7 @@
     <w:p>
       <w:pPr>
         <w:pStyle w:val="ListBullet"/>
-        <w:spacing w:before="40" w:after="80"/>
+        <w:spacing w:before="40" w:after="60"/>
         <w:ind w:left="360"/>
       </w:pPr>
       <w:r>
@@ -897,7 +1116,7 @@
     <w:p>
       <w:pPr>
         <w:pStyle w:val="ListBullet"/>
-        <w:spacing w:before="40" w:after="80"/>
+        <w:spacing w:before="40" w:after="60"/>
         <w:ind w:left="360"/>
       </w:pPr>
       <w:r>
@@ -911,13 +1130,13 @@
         <w:rPr>
           <w:color w:val="1E293B"/>
         </w:rPr>
-        <w:t>Interactive queue allowing procurement officers to filter orders by urgency tier, inspect time remaining down to the minute, and jump directly into the PO with one click.</w:t>
+        <w:t>Interactive queue allowing buyers to filter orders by urgency tier, inspect time remaining down to the minute, and jump directly into the PO with one click.</w:t>
       </w:r>
     </w:p>
     <w:p>
       <w:pPr>
         <w:pStyle w:val="ListBullet"/>
-        <w:spacing w:before="40" w:after="80"/>
+        <w:spacing w:before="40" w:after="60"/>
         <w:ind w:left="360"/>
       </w:pPr>
       <w:r>
@@ -937,7 +1156,7 @@
     <w:p>
       <w:pPr>
         <w:pStyle w:val="ListBullet"/>
-        <w:spacing w:before="40" w:after="80"/>
+        <w:spacing w:before="40" w:after="60"/>
         <w:ind w:left="360"/>
       </w:pPr>
       <w:r>
@@ -967,7 +1186,7 @@
           <w:rFonts w:ascii="Calibri" w:hAnsi="Calibri"/>
           <w:b/>
           <w:color w:val="0F294A"/>
-          <w:sz w:val="28"/>
+          <w:sz w:val="26"/>
         </w:rPr>
         <w:t>What This Means for You: Role-by-Role Guidance</w:t>
       </w:r>
@@ -979,20 +1198,20 @@
         <w:tblLook w:firstColumn="1" w:firstRow="1" w:lastColumn="0" w:lastRow="0" w:noHBand="0" w:noVBand="1" w:val="04A0"/>
       </w:tblPr>
       <w:tblGrid>
-        <w:gridCol w:w="3312"/>
-        <w:gridCol w:w="3312"/>
-        <w:gridCol w:w="3312"/>
+        <w:gridCol w:w="3360"/>
+        <w:gridCol w:w="3360"/>
+        <w:gridCol w:w="3360"/>
       </w:tblGrid>
       <w:tr>
         <w:tc>
           <w:tcPr>
-            <w:tcW w:type="dxa" w:w="3312"/>
+            <w:tcW w:type="dxa" w:w="3360"/>
             <w:shd w:fill="0F294A"/>
             <w:tcMar>
-              <w:top w:w="80" w:type="dxa"/>
-              <w:bottom w:w="80" w:type="dxa"/>
-              <w:left w:w="120" w:type="dxa"/>
-              <w:right w:w="120" w:type="dxa"/>
+              <w:top w:w="60" w:type="dxa"/>
+              <w:bottom w:w="60" w:type="dxa"/>
+              <w:left w:w="100" w:type="dxa"/>
+              <w:right w:w="100" w:type="dxa"/>
             </w:tcMar>
           </w:tcPr>
           <w:p>
@@ -1000,7 +1219,7 @@
               <w:rPr>
                 <w:b/>
                 <w:color w:val="FFFFFF"/>
-                <w:sz w:val="19"/>
+                <w:sz w:val="17"/>
               </w:rPr>
               <w:t>Role</w:t>
             </w:r>
@@ -1008,13 +1227,13 @@
         </w:tc>
         <w:tc>
           <w:tcPr>
-            <w:tcW w:type="dxa" w:w="3312"/>
+            <w:tcW w:type="dxa" w:w="3360"/>
             <w:shd w:fill="0F294A"/>
             <w:tcMar>
-              <w:top w:w="80" w:type="dxa"/>
-              <w:bottom w:w="80" w:type="dxa"/>
-              <w:left w:w="120" w:type="dxa"/>
-              <w:right w:w="120" w:type="dxa"/>
+              <w:top w:w="60" w:type="dxa"/>
+              <w:bottom w:w="60" w:type="dxa"/>
+              <w:left w:w="100" w:type="dxa"/>
+              <w:right w:w="100" w:type="dxa"/>
             </w:tcMar>
           </w:tcPr>
           <w:p>
@@ -1022,7 +1241,7 @@
               <w:rPr>
                 <w:b/>
                 <w:color w:val="FFFFFF"/>
-                <w:sz w:val="19"/>
+                <w:sz w:val="17"/>
               </w:rPr>
               <w:t>Key Benefits</w:t>
             </w:r>
@@ -1030,13 +1249,13 @@
         </w:tc>
         <w:tc>
           <w:tcPr>
-            <w:tcW w:type="dxa" w:w="3312"/>
+            <w:tcW w:type="dxa" w:w="3360"/>
             <w:shd w:fill="0F294A"/>
             <w:tcMar>
-              <w:top w:w="80" w:type="dxa"/>
-              <w:bottom w:w="80" w:type="dxa"/>
-              <w:left w:w="120" w:type="dxa"/>
-              <w:right w:w="120" w:type="dxa"/>
+              <w:top w:w="60" w:type="dxa"/>
+              <w:bottom w:w="60" w:type="dxa"/>
+              <w:left w:w="100" w:type="dxa"/>
+              <w:right w:w="100" w:type="dxa"/>
             </w:tcMar>
           </w:tcPr>
           <w:p>
@@ -1044,7 +1263,7 @@
               <w:rPr>
                 <w:b/>
                 <w:color w:val="FFFFFF"/>
-                <w:sz w:val="19"/>
+                <w:sz w:val="17"/>
               </w:rPr>
               <w:t>Action Items &amp; Best Practices</w:t>
             </w:r>
@@ -1054,13 +1273,13 @@
       <w:tr>
         <w:tc>
           <w:tcPr>
-            <w:tcW w:type="dxa" w:w="3312"/>
+            <w:tcW w:type="dxa" w:w="3360"/>
             <w:shd w:fill="F8FAFC"/>
             <w:tcMar>
-              <w:top w:w="80" w:type="dxa"/>
-              <w:bottom w:w="80" w:type="dxa"/>
-              <w:left w:w="120" w:type="dxa"/>
-              <w:right w:w="120" w:type="dxa"/>
+              <w:top w:w="60" w:type="dxa"/>
+              <w:bottom w:w="60" w:type="dxa"/>
+              <w:left w:w="100" w:type="dxa"/>
+              <w:right w:w="100" w:type="dxa"/>
             </w:tcMar>
             <w:tcBorders>
               <w:bottom w:val="single" w:sz="4" w:space="0" w:color="CBD5E1"/>
@@ -1076,7 +1295,7 @@
               <w:rPr>
                 <w:b/>
                 <w:color w:val="0F294A"/>
-                <w:sz w:val="18"/>
+                <w:sz w:val="17"/>
               </w:rPr>
               <w:t>Requisitioners</w:t>
               <w:br/>
@@ -1086,13 +1305,13 @@
         </w:tc>
         <w:tc>
           <w:tcPr>
-            <w:tcW w:type="dxa" w:w="3312"/>
+            <w:tcW w:type="dxa" w:w="3360"/>
             <w:shd w:fill="F8FAFC"/>
             <w:tcMar>
-              <w:top w:w="80" w:type="dxa"/>
-              <w:bottom w:w="80" w:type="dxa"/>
-              <w:left w:w="120" w:type="dxa"/>
-              <w:right w:w="120" w:type="dxa"/>
+              <w:top w:w="60" w:type="dxa"/>
+              <w:bottom w:w="60" w:type="dxa"/>
+              <w:left w:w="100" w:type="dxa"/>
+              <w:right w:w="100" w:type="dxa"/>
             </w:tcMar>
             <w:tcBorders>
               <w:bottom w:val="single" w:sz="4" w:space="0" w:color="CBD5E1"/>
@@ -1106,7 +1325,7 @@
             </w:pPr>
             <w:r>
               <w:rPr>
-                <w:sz w:val="18"/>
+                <w:sz w:val="17"/>
               </w:rPr>
               <w:t>• Immediate confirmation that approved items are held exclusively for your plant.</w:t>
               <w:br/>
@@ -1116,13 +1335,13 @@
         </w:tc>
         <w:tc>
           <w:tcPr>
-            <w:tcW w:type="dxa" w:w="3312"/>
+            <w:tcW w:type="dxa" w:w="3360"/>
             <w:shd w:fill="F8FAFC"/>
             <w:tcMar>
-              <w:top w:w="80" w:type="dxa"/>
-              <w:bottom w:w="80" w:type="dxa"/>
-              <w:left w:w="120" w:type="dxa"/>
-              <w:right w:w="120" w:type="dxa"/>
+              <w:top w:w="60" w:type="dxa"/>
+              <w:bottom w:w="60" w:type="dxa"/>
+              <w:left w:w="100" w:type="dxa"/>
+              <w:right w:w="100" w:type="dxa"/>
             </w:tcMar>
             <w:tcBorders>
               <w:bottom w:val="single" w:sz="4" w:space="0" w:color="CBD5E1"/>
@@ -1136,13 +1355,13 @@
             </w:pPr>
             <w:r>
               <w:rPr>
-                <w:sz w:val="18"/>
+                <w:sz w:val="17"/>
               </w:rPr>
               <w:t>• Check the available stock pill when browsing the catalogue.</w:t>
               <w:br/>
               <w:t>• Once approved, track your order's 48h countdown badge.</w:t>
               <w:br/>
-              <w:t>• Promptly check your email / notifications if your order is nearing 12h remaining.</w:t>
+              <w:t>• Check your notifications if your order is nearing 12h remaining.</w:t>
             </w:r>
           </w:p>
         </w:tc>
@@ -1150,13 +1369,13 @@
       <w:tr>
         <w:tc>
           <w:tcPr>
-            <w:tcW w:type="dxa" w:w="3312"/>
+            <w:tcW w:type="dxa" w:w="3360"/>
             <w:shd w:fill="FFFFFF"/>
             <w:tcMar>
-              <w:top w:w="80" w:type="dxa"/>
-              <w:bottom w:w="80" w:type="dxa"/>
-              <w:left w:w="120" w:type="dxa"/>
-              <w:right w:w="120" w:type="dxa"/>
+              <w:top w:w="60" w:type="dxa"/>
+              <w:bottom w:w="60" w:type="dxa"/>
+              <w:left w:w="100" w:type="dxa"/>
+              <w:right w:w="100" w:type="dxa"/>
             </w:tcMar>
             <w:tcBorders>
               <w:bottom w:val="single" w:sz="4" w:space="0" w:color="CBD5E1"/>
@@ -1172,7 +1391,7 @@
               <w:rPr>
                 <w:b/>
                 <w:color w:val="0F294A"/>
-                <w:sz w:val="18"/>
+                <w:sz w:val="17"/>
               </w:rPr>
               <w:t>Procurement Officers</w:t>
               <w:br/>
@@ -1182,13 +1401,13 @@
         </w:tc>
         <w:tc>
           <w:tcPr>
-            <w:tcW w:type="dxa" w:w="3312"/>
+            <w:tcW w:type="dxa" w:w="3360"/>
             <w:shd w:fill="FFFFFF"/>
             <w:tcMar>
-              <w:top w:w="80" w:type="dxa"/>
-              <w:bottom w:w="80" w:type="dxa"/>
-              <w:left w:w="120" w:type="dxa"/>
-              <w:right w:w="120" w:type="dxa"/>
+              <w:top w:w="60" w:type="dxa"/>
+              <w:bottom w:w="60" w:type="dxa"/>
+              <w:left w:w="100" w:type="dxa"/>
+              <w:right w:w="100" w:type="dxa"/>
             </w:tcMar>
             <w:tcBorders>
               <w:bottom w:val="single" w:sz="4" w:space="0" w:color="CBD5E1"/>
@@ -1202,7 +1421,7 @@
             </w:pPr>
             <w:r>
               <w:rPr>
-                <w:sz w:val="18"/>
+                <w:sz w:val="17"/>
               </w:rPr>
               <w:t>• Prevents stock being double-allocated to competing plants.</w:t>
               <w:br/>
@@ -1212,13 +1431,13 @@
         </w:tc>
         <w:tc>
           <w:tcPr>
-            <w:tcW w:type="dxa" w:w="3312"/>
+            <w:tcW w:type="dxa" w:w="3360"/>
             <w:shd w:fill="FFFFFF"/>
             <w:tcMar>
-              <w:top w:w="80" w:type="dxa"/>
-              <w:bottom w:w="80" w:type="dxa"/>
-              <w:left w:w="120" w:type="dxa"/>
-              <w:right w:w="120" w:type="dxa"/>
+              <w:top w:w="60" w:type="dxa"/>
+              <w:bottom w:w="60" w:type="dxa"/>
+              <w:left w:w="100" w:type="dxa"/>
+              <w:right w:w="100" w:type="dxa"/>
             </w:tcMar>
             <w:tcBorders>
               <w:bottom w:val="single" w:sz="4" w:space="0" w:color="CBD5E1"/>
@@ -1232,7 +1451,7 @@
             </w:pPr>
             <w:r>
               <w:rPr>
-                <w:sz w:val="18"/>
+                <w:sz w:val="17"/>
               </w:rPr>
               <w:t>• Monitor the 'Pending Concur PO #' filter in your Task Drawer.</w:t>
               <w:br/>
@@ -1246,13 +1465,13 @@
       <w:tr>
         <w:tc>
           <w:tcPr>
-            <w:tcW w:type="dxa" w:w="3312"/>
+            <w:tcW w:type="dxa" w:w="3360"/>
             <w:shd w:fill="F8FAFC"/>
             <w:tcMar>
-              <w:top w:w="80" w:type="dxa"/>
-              <w:bottom w:w="80" w:type="dxa"/>
-              <w:left w:w="120" w:type="dxa"/>
-              <w:right w:w="120" w:type="dxa"/>
+              <w:top w:w="60" w:type="dxa"/>
+              <w:bottom w:w="60" w:type="dxa"/>
+              <w:left w:w="100" w:type="dxa"/>
+              <w:right w:w="100" w:type="dxa"/>
             </w:tcMar>
             <w:tcBorders>
               <w:bottom w:val="single" w:sz="4" w:space="0" w:color="CBD5E1"/>
@@ -1268,7 +1487,7 @@
               <w:rPr>
                 <w:b/>
                 <w:color w:val="0F294A"/>
-                <w:sz w:val="18"/>
+                <w:sz w:val="17"/>
               </w:rPr>
               <w:t>Approvers &amp;</w:t>
               <w:br/>
@@ -1278,13 +1497,13 @@
         </w:tc>
         <w:tc>
           <w:tcPr>
-            <w:tcW w:type="dxa" w:w="3312"/>
+            <w:tcW w:type="dxa" w:w="3360"/>
             <w:shd w:fill="F8FAFC"/>
             <w:tcMar>
-              <w:top w:w="80" w:type="dxa"/>
-              <w:bottom w:w="80" w:type="dxa"/>
-              <w:left w:w="120" w:type="dxa"/>
-              <w:right w:w="120" w:type="dxa"/>
+              <w:top w:w="60" w:type="dxa"/>
+              <w:bottom w:w="60" w:type="dxa"/>
+              <w:left w:w="100" w:type="dxa"/>
+              <w:right w:w="100" w:type="dxa"/>
             </w:tcMar>
             <w:tcBorders>
               <w:bottom w:val="single" w:sz="4" w:space="0" w:color="CBD5E1"/>
@@ -1298,7 +1517,7 @@
             </w:pPr>
             <w:r>
               <w:rPr>
-                <w:sz w:val="18"/>
+                <w:sz w:val="17"/>
               </w:rPr>
               <w:t>• Confidence that approved requests correspond to confirmed available supplier stock.</w:t>
               <w:br/>
@@ -1308,13 +1527,13 @@
         </w:tc>
         <w:tc>
           <w:tcPr>
-            <w:tcW w:type="dxa" w:w="3312"/>
+            <w:tcW w:type="dxa" w:w="3360"/>
             <w:shd w:fill="F8FAFC"/>
             <w:tcMar>
-              <w:top w:w="80" w:type="dxa"/>
-              <w:bottom w:w="80" w:type="dxa"/>
-              <w:left w:w="120" w:type="dxa"/>
-              <w:right w:w="120" w:type="dxa"/>
+              <w:top w:w="60" w:type="dxa"/>
+              <w:bottom w:w="60" w:type="dxa"/>
+              <w:left w:w="100" w:type="dxa"/>
+              <w:right w:w="100" w:type="dxa"/>
             </w:tcMar>
             <w:tcBorders>
               <w:bottom w:val="single" w:sz="4" w:space="0" w:color="CBD5E1"/>
@@ -1328,7 +1547,7 @@
             </w:pPr>
             <w:r>
               <w:rPr>
-                <w:sz w:val="18"/>
+                <w:sz w:val="17"/>
               </w:rPr>
               <w:t>• Approve requisitions promptly so buyers receive the full 48-hour procurement window.</w:t>
               <w:br/>
@@ -1340,7 +1559,7 @@
     </w:tbl>
     <w:p>
       <w:pPr>
-        <w:spacing w:after="120"/>
+        <w:spacing w:after="80"/>
       </w:pPr>
     </w:p>
     <w:p>
@@ -1356,7 +1575,7 @@
           <w:rFonts w:ascii="Calibri" w:hAnsi="Calibri"/>
           <w:b/>
           <w:color w:val="0F294A"/>
-          <w:sz w:val="28"/>
+          <w:sz w:val="26"/>
         </w:rPr>
         <w:t>Frequently Asked Questions (FAQ)</w:t>
       </w:r>
@@ -1364,25 +1583,25 @@
     <w:p>
       <w:pPr>
         <w:keepNext/>
-        <w:spacing w:before="120" w:after="40"/>
+        <w:spacing w:before="100" w:after="20"/>
       </w:pPr>
       <w:r>
         <w:rPr>
           <w:b/>
           <w:color w:val="1E40AF"/>
-          <w:sz w:val="20"/>
+          <w:sz w:val="19"/>
         </w:rPr>
         <w:t>Q: What happens if an order is auto-cancelled after 48 hours?</w:t>
       </w:r>
     </w:p>
     <w:p>
       <w:pPr>
-        <w:spacing w:before="0" w:after="120"/>
+        <w:spacing w:before="0" w:after="100"/>
       </w:pPr>
       <w:r>
         <w:rPr>
           <w:color w:val="334155"/>
-          <w:sz w:val="19"/>
+          <w:sz w:val="18"/>
         </w:rPr>
         <w:t>A: The request moves to 'Cancelled' status and its reserved items are immediately returned to available supplier stock for any plant to request. The requester receives an automated system alert with full order details. If the items are still required, a new requisition can be raised.</w:t>
       </w:r>
@@ -1390,25 +1609,25 @@
     <w:p>
       <w:pPr>
         <w:keepNext/>
-        <w:spacing w:before="120" w:after="40"/>
+        <w:spacing w:before="100" w:after="20"/>
       </w:pPr>
       <w:r>
         <w:rPr>
           <w:b/>
           <w:color w:val="1E40AF"/>
-          <w:sz w:val="20"/>
+          <w:sz w:val="19"/>
         </w:rPr>
         <w:t>Q: Can a reservation be extended beyond 48 hours?</w:t>
       </w:r>
     </w:p>
     <w:p>
       <w:pPr>
-        <w:spacing w:before="0" w:after="120"/>
+        <w:spacing w:before="0" w:after="100"/>
       </w:pPr>
       <w:r>
         <w:rPr>
           <w:color w:val="334155"/>
-          <w:sz w:val="19"/>
+          <w:sz w:val="18"/>
         </w:rPr>
         <w:t>A: The 48-hour window is intentionally strict to enforce fair stock allocation across all national sites and prevent stock locking. Procurement teams should prioritize orders displaying Warning (&lt;24h) or Critical (&lt;12h) badges.</w:t>
       </w:r>
@@ -1416,25 +1635,25 @@
     <w:p>
       <w:pPr>
         <w:keepNext/>
-        <w:spacing w:before="120" w:after="40"/>
+        <w:spacing w:before="100" w:after="20"/>
       </w:pPr>
       <w:r>
         <w:rPr>
           <w:b/>
           <w:color w:val="1E40AF"/>
-          <w:sz w:val="20"/>
+          <w:sz w:val="19"/>
         </w:rPr>
         <w:t>Q: How does this interact with weekly supplier inventory spreadsheets?</w:t>
       </w:r>
     </w:p>
     <w:p>
       <w:pPr>
-        <w:spacing w:before="0" w:after="120"/>
+        <w:spacing w:before="0" w:after="100"/>
       </w:pPr>
       <w:r>
         <w:rPr>
           <w:color w:val="334155"/>
-          <w:sz w:val="19"/>
+          <w:sz w:val="18"/>
         </w:rPr>
         <w:t>A: ProcureFlow seamlessly reconciles weekly supplier inventory uploads against active reservations. New weekly reports reset the baseline SOH, while unfulfilled committed orders and active 48h reservations continue to deduct dynamically.</w:t>
       </w:r>
@@ -1442,25 +1661,25 @@
     <w:p>
       <w:pPr>
         <w:keepNext/>
-        <w:spacing w:before="120" w:after="40"/>
+        <w:spacing w:before="100" w:after="20"/>
       </w:pPr>
       <w:r>
         <w:rPr>
           <w:b/>
           <w:color w:val="1E40AF"/>
-          <w:sz w:val="20"/>
+          <w:sz w:val="19"/>
         </w:rPr>
         <w:t>Q: What happens when an order is partially delivered?</w:t>
       </w:r>
     </w:p>
     <w:p>
       <w:pPr>
-        <w:spacing w:before="0" w:after="120"/>
+        <w:spacing w:before="0" w:after="100"/>
       </w:pPr>
       <w:r>
         <w:rPr>
           <w:color w:val="334155"/>
-          <w:sz w:val="19"/>
+          <w:sz w:val="18"/>
         </w:rPr>
         <w:t>A: Only unreceived quantities remain committed. For example, if 50 units were ordered and 30 have been receipted, only the remaining 20 units continue to be deducted from available supplier stock.</w:t>
       </w:r>
@@ -1478,14 +1697,14 @@
           <w:rFonts w:ascii="Calibri" w:hAnsi="Calibri"/>
           <w:b/>
           <w:color w:val="0F294A"/>
-          <w:sz w:val="28"/>
+          <w:sz w:val="26"/>
         </w:rPr>
         <w:t>Questions &amp; Key Contacts</w:t>
       </w:r>
     </w:p>
     <w:p>
       <w:pPr>
-        <w:spacing w:before="80" w:after="160"/>
+        <w:spacing w:before="80" w:after="120"/>
       </w:pPr>
       <w:r>
         <w:t>Please direct any questions, discrepancies, or feedback to the appropriate lead below:</w:t>
@@ -1499,8 +1718,8 @@
         <w:tblLook w:firstColumn="1" w:firstRow="1" w:lastColumn="0" w:lastRow="0" w:noHBand="0" w:noVBand="1" w:val="04A0"/>
       </w:tblPr>
       <w:tblGrid>
-        <w:gridCol w:w="4968"/>
-        <w:gridCol w:w="4968"/>
+        <w:gridCol w:w="5040"/>
+        <w:gridCol w:w="5040"/>
       </w:tblGrid>
       <w:tr>
         <w:tc>
@@ -1508,10 +1727,10 @@
             <w:tcW w:type="dxa" w:w="4896"/>
             <w:shd w:fill="F8FAFC"/>
             <w:tcMar>
-              <w:top w:w="120" w:type="dxa"/>
-              <w:bottom w:w="120" w:type="dxa"/>
-              <w:left w:w="140" w:type="dxa"/>
-              <w:right w:w="140" w:type="dxa"/>
+              <w:top w:w="100" w:type="dxa"/>
+              <w:bottom w:w="100" w:type="dxa"/>
+              <w:left w:w="120" w:type="dxa"/>
+              <w:right w:w="120" w:type="dxa"/>
             </w:tcMar>
             <w:tcBorders>
               <w:left w:val="single" w:sz="24" w:space="0" w:color="1E40AF"/>
@@ -1528,7 +1747,7 @@
               <w:rPr>
                 <w:b/>
                 <w:color w:val="1E40AF"/>
-                <w:sz w:val="16"/>
+                <w:sz w:val="15"/>
               </w:rPr>
               <w:t>PROCUREMENT &amp; INVENTORY INQUIRIES</w:t>
               <w:br/>
@@ -1537,7 +1756,7 @@
               <w:rPr>
                 <w:b/>
                 <w:color w:val="0F294A"/>
-                <w:sz w:val="22"/>
+                <w:sz w:val="21"/>
               </w:rPr>
               <w:t>Ashish Chhabra</w:t>
               <w:br/>
@@ -1545,7 +1764,7 @@
             <w:r>
               <w:rPr>
                 <w:color w:val="64748B"/>
-                <w:sz w:val="19"/>
+                <w:sz w:val="18"/>
               </w:rPr>
               <w:t>Procurement &amp; Inventory Manager</w:t>
               <w:br/>
@@ -1553,20 +1772,20 @@
           </w:p>
           <w:p>
             <w:pPr>
-              <w:spacing w:before="40" w:after="80"/>
+              <w:spacing w:before="40" w:after="60"/>
             </w:pPr>
             <w:r>
               <w:rPr>
                 <w:b/>
                 <w:color w:val="0F294A"/>
-                <w:sz w:val="18"/>
+                <w:sz w:val="17"/>
               </w:rPr>
               <w:t xml:space="preserve">Email: </w:t>
             </w:r>
             <w:r>
               <w:rPr>
                 <w:color w:val="2563EB"/>
-                <w:sz w:val="18"/>
+                <w:sz w:val="17"/>
                 <w:u w:val="single"/>
               </w:rPr>
               <w:t>ashish.chhabra@splservices.com.au</w:t>
@@ -1574,13 +1793,13 @@
           </w:p>
           <w:p>
             <w:pPr>
-              <w:spacing w:before="40" w:after="0"/>
+              <w:spacing w:before="20" w:after="0"/>
             </w:pPr>
             <w:r>
               <w:rPr>
                 <w:i/>
                 <w:color w:val="475569"/>
-                <w:sz w:val="17"/>
+                <w:sz w:val="16"/>
               </w:rPr>
               <w:t>Supplier stock availability, inventory quotas, PO approval escalation, and Concur PO processing queries.</w:t>
             </w:r>
@@ -1591,10 +1810,10 @@
             <w:tcW w:type="dxa" w:w="4896"/>
             <w:shd w:fill="F8FAFC"/>
             <w:tcMar>
-              <w:top w:w="120" w:type="dxa"/>
-              <w:bottom w:w="120" w:type="dxa"/>
-              <w:left w:w="140" w:type="dxa"/>
-              <w:right w:w="140" w:type="dxa"/>
+              <w:top w:w="100" w:type="dxa"/>
+              <w:bottom w:w="100" w:type="dxa"/>
+              <w:left w:w="120" w:type="dxa"/>
+              <w:right w:w="120" w:type="dxa"/>
             </w:tcMar>
             <w:tcBorders>
               <w:left w:val="single" w:sz="24" w:space="0" w:color="1E40AF"/>
@@ -1611,7 +1830,7 @@
               <w:rPr>
                 <w:b/>
                 <w:color w:val="1E40AF"/>
-                <w:sz w:val="16"/>
+                <w:sz w:val="15"/>
               </w:rPr>
               <w:t>PROCUREFLOW DEVELOPMENT &amp; AUTOMATION</w:t>
               <w:br/>
@@ -1620,7 +1839,7 @@
               <w:rPr>
                 <w:b/>
                 <w:color w:val="0F294A"/>
-                <w:sz w:val="22"/>
+                <w:sz w:val="21"/>
               </w:rPr>
               <w:t>Aaron Bell</w:t>
               <w:br/>
@@ -1628,7 +1847,7 @@
             <w:r>
               <w:rPr>
                 <w:color w:val="64748B"/>
-                <w:sz w:val="19"/>
+                <w:sz w:val="18"/>
               </w:rPr>
               <w:t>Enterprise Data and Automation Manager</w:t>
               <w:br/>
@@ -1636,20 +1855,20 @@
           </w:p>
           <w:p>
             <w:pPr>
-              <w:spacing w:before="40" w:after="80"/>
+              <w:spacing w:before="40" w:after="60"/>
             </w:pPr>
             <w:r>
               <w:rPr>
                 <w:b/>
                 <w:color w:val="0F294A"/>
-                <w:sz w:val="18"/>
+                <w:sz w:val="17"/>
               </w:rPr>
               <w:t xml:space="preserve">Email: </w:t>
             </w:r>
             <w:r>
               <w:rPr>
                 <w:color w:val="2563EB"/>
-                <w:sz w:val="18"/>
+                <w:sz w:val="17"/>
                 <w:u w:val="single"/>
               </w:rPr>
               <w:t>aaron.bell@splservices.com.au</w:t>
@@ -1657,13 +1876,13 @@
           </w:p>
           <w:p>
             <w:pPr>
-              <w:spacing w:before="40" w:after="0"/>
+              <w:spacing w:before="20" w:after="0"/>
             </w:pPr>
             <w:r>
               <w:rPr>
                 <w:i/>
                 <w:color w:val="475569"/>
-                <w:sz w:val="17"/>
+                <w:sz w:val="16"/>
               </w:rPr>
               <w:t>ProcureFlow platform features, reservation engine logic, reporting tools, and system workflow enhancements.</w:t>
             </w:r>
@@ -1673,7 +1892,7 @@
     </w:tbl>
     <w:p>
       <w:pPr>
-        <w:spacing w:after="200"/>
+        <w:spacing w:after="160"/>
       </w:pPr>
     </w:p>
     <w:p>
@@ -1693,7 +1912,7 @@
     </w:p>
     <w:sectPr>
       <w:pgSz w:w="12240" w:h="15840"/>
-      <w:pgMar w:top="1152" w:right="1152" w:bottom="1152" w:left="1152" w:header="720" w:footer="720" w:gutter="0"/>
+      <w:pgMar w:top="1080" w:right="1080" w:bottom="1080" w:left="1080" w:header="720" w:footer="720" w:gutter="0"/>
       <w:cols w:space="720"/>
       <w:docGrid w:linePitch="360"/>
     </w:sectPr>
@@ -2067,7 +2286,7 @@
     <w:rPr>
       <w:rFonts w:ascii="Calibri" w:hAnsi="Calibri"/>
       <w:color w:val="1E293B"/>
-      <w:sz w:val="21"/>
+      <w:sz w:val="20"/>
     </w:rPr>
   </w:style>
   <w:style w:type="paragraph" w:styleId="Header">

</xml_diff>